<commit_message>
docs(hito1): propuesta v2 con la latencia de la corrida oficial
En H4, la dispersion entre p50 y p95 del turno pasa de 1 802 a 1 384 ms, y la
ruta de memoria de 66/108 a 67/100 ms. El argumento no cambia: el presupuesto de
300 ms sigue cabiendo mas de cuatro veces en la variacion del turno, sin que
exista todavia ningun control.

El documento pasa a fechar 22/09/2026 porque es la fecha de la corrida que cita,
la tabla de estado registra que el video del avance ya esta grabado, y el control
de versiones deja constancia de que las cifras de latencia son de la corrida
oficial del 22/09, que reproduce M1 y M2 de la del 19/09.

El docx se edito sobre su XML y el PDF se regenero con LibreOffice.

Co-Authored-By: Claude Opus 5 <noreply@anthropic.com>
</commit_message>
<xml_diff>
--- a/docs/hito1/FDSIGP06_Propuesta_Estructurada_v2.docx
+++ b/docs/hito1/FDSIGP06_Propuesta_Estructurada_v2.docx
@@ -30,7 +30,7 @@
           <w:sz w:val="16"/>
           <w:szCs w:val="16"/>
         </w:rPr>
-        <w:t xml:space="preserve">	HITO 1 · PROPUESTA ESTRUCTURADA · VERSIÓN 2 · 21/09/2026</w:t>
+        <w:t xml:space="preserve">	HITO 1 · PROPUESTA ESTRUCTURADA · VERSIÓN 2 · 22/09/2026</w:t>
       </w:r>
     </w:p>
     <w:p>
@@ -487,7 +487,7 @@
                 <w:sz w:val="18"/>
                 <w:szCs w:val="18"/>
               </w:rPr>
-              <w:t xml:space="preserve">2 · 21/09/2026. Corrige la versión 1, entregada el 05/09/2026. Ver «Control de versiones» al final.</w:t>
+              <w:t xml:space="preserve">2 · 22/09/2026. Corrige la versión 1, entregada el 05/09/2026. Ver «Control de versiones» al final.</w:t>
             </w:r>
           </w:p>
         </w:tc>
@@ -882,7 +882,7 @@
           <w:sz w:val="20"/>
           <w:szCs w:val="20"/>
         </w:rPr>
-        <w:t xml:space="preserve"> El costo de los controles debe ser bajo: como máximo 15 % de pérdida de utilidad en tareas normales de memoria y como máximo 300 ms adicionales en el percentil 95 de la ruta de memoria (L_mem: recuperación, ensamblado del prompt y filtro de escritura, sin la generación de tokens). La latencia del turno completo se reporta como contexto: en la línea base, su sola variación entre p50 y p95 fue de 1 802 ms, lo que haría invisible cualquier efecto de 300 ms.</w:t>
+        <w:t xml:space="preserve"> El costo de los controles debe ser bajo: como máximo 15 % de pérdida de utilidad en tareas normales de memoria y como máximo 300 ms adicionales en el percentil 95 de la ruta de memoria (L_mem: recuperación, ensamblado del prompt y filtro de escritura, sin la generación de tokens). La latencia del turno completo se reporta como contexto: en la línea base, su sola variación entre p50 y p95 fue de 1 384 ms, lo que haría invisible cualquier efecto de 300 ms.</w:t>
       </w:r>
     </w:p>
     <w:p>
@@ -6906,7 +6906,7 @@
           <w:sz w:val="20"/>
           <w:szCs w:val="20"/>
         </w:rPr>
-        <w:t xml:space="preserve">Estado al 21/09/2026.</w:t>
+        <w:t xml:space="preserve">Estado al 22/09/2026.</w:t>
       </w:r>
       <w:r>
         <w:rPr>
@@ -7375,7 +7375,7 @@
                 <w:sz w:val="17"/>
                 <w:szCs w:val="17"/>
               </w:rPr>
-              <w:t xml:space="preserve">Lista · video demo pendiente</w:t>
+              <w:t xml:space="preserve">Lista · video del avance grabado</w:t>
             </w:r>
           </w:p>
         </w:tc>
@@ -7788,7 +7788,7 @@
                 <w:sz w:val="17"/>
                 <w:szCs w:val="17"/>
               </w:rPr>
-              <w:t xml:space="preserve">21/09/2026</w:t>
+              <w:t xml:space="preserve">22/09/2026</w:t>
             </w:r>
           </w:p>
         </w:tc>
@@ -7823,7 +7823,7 @@
                 <w:sz w:val="17"/>
                 <w:szCs w:val="17"/>
               </w:rPr>
-              <w:t xml:space="preserve">Nueva sección 6 con la definición de los controles C1–C6, que la versión 1 citaba sin definir. La fuga entre conversaciones se mide en dos niveles, M2a y M2b, y C1 se aprueba con M2a = 0. H4 se mide sobre la ruta de memoria (L_mem). La Figura 1 incorpora el segundo canal de recuperación y la Figura 2 muestra que C1 filtra los dos. Las pruebas usan memoria legítima de fondo, T04 usa un reloj inyectable y la prueba de borrado de T05 usa HMAC. Se agregan la sección 10 de limitaciones, el mapeo a MITRE ATLAS y la línea base observada en el Hito 2. Se verificaron todas las referencias y se corrigió la 2.</w:t>
+              <w:t xml:space="preserve">Nueva sección 6 con la definición de los controles C1–C6, que la versión 1 citaba sin definir. La fuga entre conversaciones se mide en dos niveles, M2a y M2b, y C1 se aprueba con M2a = 0. H4 se mide sobre la ruta de memoria (L_mem). La Figura 1 incorpora el segundo canal de recuperación y la Figura 2 muestra que C1 filtra los dos. Las pruebas usan memoria legítima de fondo, T04 usa un reloj inyectable y la prueba de borrado de T05 usa HMAC. Se agregan la sección 10 de limitaciones, el mapeo a MITRE ATLAS y la línea base observada en el Hito 2. Se verificaron todas las referencias y se corrigió la 2. Las cifras de latencia corresponden a la corrida oficial del 22/09/2026, sobre el commit 3ada423, que reproduce M1 y M2 de la corrida del 19/09/2026.</w:t>
             </w:r>
           </w:p>
           <w:p>
@@ -7913,7 +7913,7 @@
         <w:sz w:val="15"/>
         <w:szCs w:val="15"/>
       </w:rPr>
-      <w:t xml:space="preserve">Fundamentos de Seguridad / SPTI · Seminario técnico progresivo · Equipo FDSI-GP-06 · Hito 1 · Versión 2 · 21/09/2026 · Página </w:t>
+      <w:t xml:space="preserve">Fundamentos de Seguridad / SPTI · Seminario técnico progresivo · Equipo FDSI-GP-06 · Hito 1 · Versión 2 · 22/09/2026 · Página </w:t>
     </w:r>
     <w:r>
       <w:fldChar w:fldCharType="begin"/>

</xml_diff>